<commit_message>
Deploy preview for PR 100 🛫
</commit_message>
<xml_diff>
--- a/pr-preview/pr-100/vignettes/articles/package-structure.docx
+++ b/pr-preview/pr-100/vignettes/articles/package-structure.docx
@@ -23,7 +23,7 @@
         <w:pStyle w:val="Date"/>
       </w:pPr>
       <w:r>
-        <w:t xml:space="preserve">2026-02-03</w:t>
+        <w:t xml:space="preserve">2026-05-04</w:t>
       </w:r>
     </w:p>
     <w:p>
@@ -43,7 +43,7 @@
         <w:t xml:space="preserve">(rpt)</w:t>
       </w:r>
     </w:p>
-    <w:bookmarkStart w:id="21" w:name="overview"/>
+    <w:bookmarkStart w:id="10" w:name="overview"/>
     <w:p>
       <w:pPr>
         <w:pStyle w:val="Heading2"/>
@@ -62,7 +62,7 @@
       <w:r>
         <w:t xml:space="preserve"> </w:t>
       </w:r>
-      <w:hyperlink r:id="rId20">
+      <w:hyperlink r:id="rId9">
         <w:r>
           <w:rPr>
             <w:rStyle w:val="VerbatimChar"/>
@@ -125,8 +125,8 @@
         <w:t xml:space="preserve">Onboard new contributors more effectively</w:t>
       </w:r>
     </w:p>
-    <w:bookmarkEnd w:id="21"/>
-    <w:bookmarkStart w:id="22" w:name="what-is-foodwebr"/>
+    <w:bookmarkEnd w:id="10"/>
+    <w:bookmarkStart w:id="11" w:name="what-is-foodwebr"/>
     <w:p>
       <w:pPr>
         <w:pStyle w:val="Heading2"/>
@@ -206,8 +206,8 @@
         <w:t xml:space="preserve">Planning refactoring efforts</w:t>
       </w:r>
     </w:p>
-    <w:bookmarkEnd w:id="22"/>
-    <w:bookmarkStart w:id="23" w:name="installing-foodwebr"/>
+    <w:bookmarkEnd w:id="11"/>
+    <w:bookmarkStart w:id="12" w:name="installing-foodwebr"/>
     <w:p>
       <w:pPr>
         <w:pStyle w:val="Heading2"/>
@@ -317,8 +317,8 @@
         <w:t xml:space="preserve">)</w:t>
       </w:r>
     </w:p>
-    <w:bookmarkEnd w:id="23"/>
-    <w:bookmarkStart w:id="31" w:name="visualizing-package-structure"/>
+    <w:bookmarkEnd w:id="12"/>
+    <w:bookmarkStart w:id="20" w:name="visualizing-package-structure"/>
     <w:p>
       <w:pPr>
         <w:pStyle w:val="Heading2"/>
@@ -327,7 +327,7 @@
         <w:t xml:space="preserve">4 Visualizing Package Structure</w:t>
       </w:r>
     </w:p>
-    <w:bookmarkStart w:id="24" w:name="basic-usage"/>
+    <w:bookmarkStart w:id="13" w:name="basic-usage"/>
     <w:p>
       <w:pPr>
         <w:pStyle w:val="Heading3"/>
@@ -523,8 +523,8 @@
         <w:t xml:space="preserve">#&gt; }</w:t>
       </w:r>
     </w:p>
-    <w:bookmarkEnd w:id="24"/>
-    <w:bookmarkStart w:id="28" w:name="plotting-the-dependency-graph"/>
+    <w:bookmarkEnd w:id="13"/>
+    <w:bookmarkStart w:id="17" w:name="plotting-the-dependency-graph"/>
     <w:p>
       <w:pPr>
         <w:pStyle w:val="Heading3"/>
@@ -614,18 +614,18 @@
                 <wp:inline>
                   <wp:extent cx="152400" cy="152400"/>
                   <wp:effectExtent b="0" l="0" r="0" t="0"/>
-                  <wp:docPr descr="" title="" id="26" name="Picture"/>
+                  <wp:docPr descr="" title="" id="15" name="Picture"/>
                   <a:graphic>
                     <a:graphicData uri="http://schemas.openxmlformats.org/drawingml/2006/picture">
                       <pic:pic>
                         <pic:nvPicPr>
-                          <pic:cNvPr descr="/opt/quarto/share/formats/docx/note.png" id="27" name="Picture"/>
+                          <pic:cNvPr descr="/opt/quarto/share/formats/docx/note.png" id="16" name="Picture"/>
                           <pic:cNvPicPr>
                             <a:picLocks noChangeArrowheads="1" noChangeAspect="1"/>
                           </pic:cNvPicPr>
                         </pic:nvPicPr>
                         <pic:blipFill>
-                          <a:blip r:embed="rId25"/>
+                          <a:blip r:embed="rId14"/>
                           <a:stretch>
                             <a:fillRect/>
                           </a:stretch>
@@ -752,8 +752,8 @@
         </w:tc>
       </w:tr>
     </w:tbl>
-    <w:bookmarkEnd w:id="28"/>
-    <w:bookmarkStart w:id="29" w:name="filtering-options"/>
+    <w:bookmarkEnd w:id="17"/>
+    <w:bookmarkStart w:id="18" w:name="filtering-options"/>
     <w:p>
       <w:pPr>
         <w:pStyle w:val="Heading3"/>
@@ -946,8 +946,8 @@
         <w:t xml:space="preserve">)</w:t>
       </w:r>
     </w:p>
-    <w:bookmarkEnd w:id="29"/>
-    <w:bookmarkStart w:id="30" w:name="examining-the-entire-package"/>
+    <w:bookmarkEnd w:id="18"/>
+    <w:bookmarkStart w:id="19" w:name="examining-the-entire-package"/>
     <w:p>
       <w:pPr>
         <w:pStyle w:val="Heading3"/>
@@ -1184,9 +1184,9 @@
         <w:t xml:space="preserve">(fw_pkg)</w:t>
       </w:r>
     </w:p>
-    <w:bookmarkEnd w:id="30"/>
-    <w:bookmarkEnd w:id="31"/>
-    <w:bookmarkStart w:id="37" w:name="analyzing-dependencies"/>
+    <w:bookmarkEnd w:id="19"/>
+    <w:bookmarkEnd w:id="20"/>
+    <w:bookmarkStart w:id="26" w:name="analyzing-dependencies"/>
     <w:p>
       <w:pPr>
         <w:pStyle w:val="Heading2"/>
@@ -1195,7 +1195,7 @@
         <w:t xml:space="preserve">5 Analyzing Dependencies</w:t>
       </w:r>
     </w:p>
-    <w:bookmarkStart w:id="32" w:name="understanding-function-roles"/>
+    <w:bookmarkStart w:id="21" w:name="understanding-function-roles"/>
     <w:p>
       <w:pPr>
         <w:pStyle w:val="Heading3"/>
@@ -1288,8 +1288,8 @@
         <w:t xml:space="preserve">: Functions with no connections to others</w:t>
       </w:r>
     </w:p>
-    <w:bookmarkEnd w:id="32"/>
-    <w:bookmarkStart w:id="36" w:name="example-analysis"/>
+    <w:bookmarkEnd w:id="21"/>
+    <w:bookmarkStart w:id="25" w:name="example-analysis"/>
     <w:p>
       <w:pPr>
         <w:pStyle w:val="Heading3"/>
@@ -1457,18 +1457,18 @@
                 <wp:inline>
                   <wp:extent cx="152400" cy="152400"/>
                   <wp:effectExtent b="0" l="0" r="0" t="0"/>
-                  <wp:docPr descr="" title="" id="34" name="Picture"/>
+                  <wp:docPr descr="" title="" id="23" name="Picture"/>
                   <a:graphic>
                     <a:graphicData uri="http://schemas.openxmlformats.org/drawingml/2006/picture">
                       <pic:pic>
                         <pic:nvPicPr>
-                          <pic:cNvPr descr="/opt/quarto/share/formats/docx/tip.png" id="35" name="Picture"/>
+                          <pic:cNvPr descr="/opt/quarto/share/formats/docx/tip.png" id="24" name="Picture"/>
                           <pic:cNvPicPr>
                             <a:picLocks noChangeArrowheads="1" noChangeAspect="1"/>
                           </pic:cNvPicPr>
                         </pic:nvPicPr>
                         <pic:blipFill>
-                          <a:blip r:embed="rId33"/>
+                          <a:blip r:embed="rId22"/>
                           <a:stretch>
                             <a:fillRect/>
                           </a:stretch>
@@ -1827,9 +1827,9 @@
         </w:tc>
       </w:tr>
     </w:tbl>
-    <w:bookmarkEnd w:id="36"/>
-    <w:bookmarkEnd w:id="37"/>
-    <w:bookmarkStart w:id="39" w:name="package-architecture"/>
+    <w:bookmarkEnd w:id="25"/>
+    <w:bookmarkEnd w:id="26"/>
+    <w:bookmarkStart w:id="28" w:name="package-architecture"/>
     <w:p>
       <w:pPr>
         <w:pStyle w:val="Heading2"/>
@@ -1838,7 +1838,7 @@
         <w:t xml:space="preserve">6 Package Architecture</w:t>
       </w:r>
     </w:p>
-    <w:bookmarkStart w:id="38" w:name="current-structure"/>
+    <w:bookmarkStart w:id="27" w:name="current-structure"/>
     <w:p>
       <w:pPr>
         <w:pStyle w:val="Heading3"/>
@@ -2361,9 +2361,9 @@
         <w:t xml:space="preserve">This architecture demonstrates good separation of concerns with clear data flow from validation through cleaning to calculation and formatting.</w:t>
       </w:r>
     </w:p>
-    <w:bookmarkEnd w:id="38"/>
-    <w:bookmarkEnd w:id="39"/>
-    <w:bookmarkStart w:id="43" w:name="advanced-usage"/>
+    <w:bookmarkEnd w:id="27"/>
+    <w:bookmarkEnd w:id="28"/>
+    <w:bookmarkStart w:id="32" w:name="advanced-usage"/>
     <w:p>
       <w:pPr>
         <w:pStyle w:val="Heading2"/>
@@ -2372,7 +2372,7 @@
         <w:t xml:space="preserve">7 Advanced Usage</w:t>
       </w:r>
     </w:p>
-    <w:bookmarkStart w:id="40" w:name="using-with-tidygraph"/>
+    <w:bookmarkStart w:id="29" w:name="using-with-tidygraph"/>
     <w:p>
       <w:pPr>
         <w:pStyle w:val="Heading3"/>
@@ -2742,8 +2742,8 @@
         <w:t xml:space="preserve">#&gt; # ℹ 4 more rows</w:t>
       </w:r>
     </w:p>
-    <w:bookmarkEnd w:id="40"/>
-    <w:bookmarkStart w:id="41" w:name="customizing-visualizations"/>
+    <w:bookmarkEnd w:id="29"/>
+    <w:bookmarkStart w:id="30" w:name="customizing-visualizations"/>
     <w:p>
       <w:pPr>
         <w:pStyle w:val="Heading3"/>
@@ -2852,8 +2852,8 @@
         <w:t xml:space="preserve">)</w:t>
       </w:r>
     </w:p>
-    <w:bookmarkEnd w:id="41"/>
-    <w:bookmarkStart w:id="42" w:name="exporting-as-text"/>
+    <w:bookmarkEnd w:id="30"/>
+    <w:bookmarkStart w:id="31" w:name="exporting-as-text"/>
     <w:p>
       <w:pPr>
         <w:pStyle w:val="Heading3"/>
@@ -3061,9 +3061,9 @@
         <w:t xml:space="preserve">#&gt; }</w:t>
       </w:r>
     </w:p>
-    <w:bookmarkEnd w:id="42"/>
-    <w:bookmarkEnd w:id="43"/>
-    <w:bookmarkStart w:id="50" w:name="practical-applications"/>
+    <w:bookmarkEnd w:id="31"/>
+    <w:bookmarkEnd w:id="32"/>
+    <w:bookmarkStart w:id="39" w:name="practical-applications"/>
     <w:p>
       <w:pPr>
         <w:pStyle w:val="Heading2"/>
@@ -3072,7 +3072,7 @@
         <w:t xml:space="preserve">8 Practical Applications</w:t>
       </w:r>
     </w:p>
-    <w:bookmarkStart w:id="44" w:name="code-review"/>
+    <w:bookmarkStart w:id="33" w:name="code-review"/>
     <w:p>
       <w:pPr>
         <w:pStyle w:val="Heading3"/>
@@ -3137,8 +3137,8 @@
         <w:t xml:space="preserve">Detect circular dependencies</w:t>
       </w:r>
     </w:p>
-    <w:bookmarkEnd w:id="44"/>
-    <w:bookmarkStart w:id="45" w:name="refactoring"/>
+    <w:bookmarkEnd w:id="33"/>
+    <w:bookmarkStart w:id="34" w:name="refactoring"/>
     <w:p>
       <w:pPr>
         <w:pStyle w:val="Heading3"/>
@@ -3203,8 +3203,8 @@
         <w:t xml:space="preserve">After refactoring, regenerate the graph to verify improvements</w:t>
       </w:r>
     </w:p>
-    <w:bookmarkEnd w:id="45"/>
-    <w:bookmarkStart w:id="49" w:name="documentation"/>
+    <w:bookmarkEnd w:id="34"/>
+    <w:bookmarkStart w:id="38" w:name="documentation"/>
     <w:p>
       <w:pPr>
         <w:pStyle w:val="Heading3"/>
@@ -3310,18 +3310,18 @@
                 <wp:inline>
                   <wp:extent cx="152400" cy="152400"/>
                   <wp:effectExtent b="0" l="0" r="0" t="0"/>
-                  <wp:docPr descr="" title="" id="47" name="Picture"/>
+                  <wp:docPr descr="" title="" id="36" name="Picture"/>
                   <a:graphic>
                     <a:graphicData uri="http://schemas.openxmlformats.org/drawingml/2006/picture">
                       <pic:pic>
                         <pic:nvPicPr>
-                          <pic:cNvPr descr="/opt/quarto/share/formats/docx/important.png" id="48" name="Picture"/>
+                          <pic:cNvPr descr="/opt/quarto/share/formats/docx/important.png" id="37" name="Picture"/>
                           <pic:cNvPicPr>
                             <a:picLocks noChangeArrowheads="1" noChangeAspect="1"/>
                           </pic:cNvPicPr>
                         </pic:nvPicPr>
                         <pic:blipFill>
-                          <a:blip r:embed="rId46"/>
+                          <a:blip r:embed="rId35"/>
                           <a:stretch>
                             <a:fillRect/>
                           </a:stretch>
@@ -3385,9 +3385,9 @@
         </w:tc>
       </w:tr>
     </w:tbl>
-    <w:bookmarkEnd w:id="49"/>
-    <w:bookmarkEnd w:id="50"/>
-    <w:bookmarkStart w:id="53" w:name="exploring-specific-functions"/>
+    <w:bookmarkEnd w:id="38"/>
+    <w:bookmarkEnd w:id="39"/>
+    <w:bookmarkStart w:id="42" w:name="exploring-specific-functions"/>
     <w:p>
       <w:pPr>
         <w:pStyle w:val="Heading2"/>
@@ -3404,7 +3404,7 @@
         <w:t xml:space="preserve">You can focus on specific functions to understand their dependencies:</w:t>
       </w:r>
     </w:p>
-    <w:bookmarkStart w:id="51" w:name="example-function-dependencies"/>
+    <w:bookmarkStart w:id="40" w:name="example-function-dependencies"/>
     <w:p>
       <w:pPr>
         <w:pStyle w:val="Heading3"/>
@@ -3475,8 +3475,8 @@
         <w:t xml:space="preserve">(fw_example)</w:t>
       </w:r>
     </w:p>
-    <w:bookmarkEnd w:id="51"/>
-    <w:bookmarkStart w:id="52" w:name="summary-function-dependencies"/>
+    <w:bookmarkEnd w:id="40"/>
+    <w:bookmarkStart w:id="41" w:name="summary-function-dependencies"/>
     <w:p>
       <w:pPr>
         <w:pStyle w:val="Heading3"/>
@@ -3591,9 +3591,9 @@
         <w:t xml:space="preserve">The complete call chain for a given function</w:t>
       </w:r>
     </w:p>
-    <w:bookmarkEnd w:id="52"/>
-    <w:bookmarkEnd w:id="53"/>
-    <w:bookmarkStart w:id="54" w:name="best-practices"/>
+    <w:bookmarkEnd w:id="41"/>
+    <w:bookmarkEnd w:id="42"/>
+    <w:bookmarkStart w:id="43" w:name="best-practices"/>
     <w:p>
       <w:pPr>
         <w:pStyle w:val="Heading2"/>
@@ -3720,8 +3720,8 @@
         <w:t xml:space="preserve">: Check dependency graphs during code review</w:t>
       </w:r>
     </w:p>
-    <w:bookmarkEnd w:id="54"/>
-    <w:bookmarkStart w:id="59" w:name="learn-more"/>
+    <w:bookmarkEnd w:id="43"/>
+    <w:bookmarkStart w:id="48" w:name="learn-more"/>
     <w:p>
       <w:pPr>
         <w:pStyle w:val="Heading2"/>
@@ -3751,7 +3751,7 @@
       <w:r>
         <w:t xml:space="preserve"> </w:t>
       </w:r>
-      <w:hyperlink r:id="rId20">
+      <w:hyperlink r:id="rId9">
         <w:r>
           <w:rPr>
             <w:rStyle w:val="Hyperlink"/>
@@ -3781,7 +3781,7 @@
       <w:r>
         <w:t xml:space="preserve"> </w:t>
       </w:r>
-      <w:hyperlink r:id="rId55">
+      <w:hyperlink r:id="rId44">
         <w:r>
           <w:rPr>
             <w:rStyle w:val="Hyperlink"/>
@@ -3811,7 +3811,7 @@
       <w:r>
         <w:t xml:space="preserve"> </w:t>
       </w:r>
-      <w:hyperlink r:id="rId56">
+      <w:hyperlink r:id="rId45">
         <w:r>
           <w:rPr>
             <w:rStyle w:val="Hyperlink"/>
@@ -3841,7 +3841,7 @@
       <w:r>
         <w:t xml:space="preserve"> </w:t>
       </w:r>
-      <w:hyperlink r:id="rId57">
+      <w:hyperlink r:id="rId46">
         <w:r>
           <w:rPr>
             <w:rStyle w:val="Hyperlink"/>
@@ -3871,7 +3871,7 @@
       <w:r>
         <w:t xml:space="preserve"> </w:t>
       </w:r>
-      <w:hyperlink r:id="rId58">
+      <w:hyperlink r:id="rId47">
         <w:r>
           <w:rPr>
             <w:rStyle w:val="Hyperlink"/>
@@ -3880,8 +3880,8 @@
         </w:r>
       </w:hyperlink>
     </w:p>
-    <w:bookmarkEnd w:id="59"/>
-    <w:bookmarkStart w:id="60" w:name="summary"/>
+    <w:bookmarkEnd w:id="48"/>
+    <w:bookmarkStart w:id="49" w:name="summary"/>
     <w:p>
       <w:pPr>
         <w:pStyle w:val="Heading2"/>
@@ -4109,8 +4109,8 @@
         <w:t xml:space="preserve">This structure makes the code easier to understand, test, and maintain.</w:t>
       </w:r>
     </w:p>
-    <w:bookmarkEnd w:id="60"/>
-    <w:bookmarkStart w:id="62" w:name="references"/>
+    <w:bookmarkEnd w:id="49"/>
+    <w:bookmarkStart w:id="51" w:name="references"/>
     <w:p>
       <w:pPr>
         <w:pStyle w:val="Heading2"/>
@@ -4119,9 +4119,9 @@
         <w:t xml:space="preserve">13 References</w:t>
       </w:r>
     </w:p>
-    <w:bookmarkStart w:id="61" w:name="refs"/>
-    <w:bookmarkEnd w:id="61"/>
-    <w:bookmarkEnd w:id="62"/>
+    <w:bookmarkStart w:id="50" w:name="refs"/>
+    <w:bookmarkEnd w:id="50"/>
+    <w:bookmarkEnd w:id="51"/>
     <w:sectPr>
       <w:footnotePr>
         <w:numRestart w:val="eachSect"/>
@@ -4560,10 +4560,10 @@
   <w:docDefaults>
     <w:rPrDefault>
       <w:rPr>
-        <w:rFonts w:asciiTheme="minorHAnsi" w:cstheme="minorBidi" w:eastAsiaTheme="minorHAnsi" w:hAnsiTheme="minorHAnsi"/>
+        <w:rFonts w:asciiTheme="minorHAnsi" w:cstheme="minorBidi" w:eastAsiaTheme="minorEastAsia" w:hAnsiTheme="minorHAnsi"/>
         <w:sz w:val="24"/>
         <w:szCs w:val="24"/>
-        <w:lang w:bidi="ar-SA" w:eastAsia="en-US" w:val="en-US"/>
+        <w:lang w:bidi="ar-SA" w:eastAsia="zh-CN" w:val="en-US"/>
       </w:rPr>
     </w:rPrDefault>
     <w:pPrDefault>
@@ -5104,13 +5104,6 @@
       </w:tblCellMar>
     </w:tblPr>
     <w:tblStylePr w:type="firstRow">
-      <w:tblPr>
-        <w:jc w:val="left"/>
-        <w:tblInd w:type="dxa" w:w="0"/>
-      </w:tblPr>
-      <w:trPr>
-        <w:jc w:val="left"/>
-      </w:trPr>
       <w:tcPr>
         <w:tcBorders>
           <w:bottom w:val="single"/>

</xml_diff>